<commit_message>
Add PCO roster fill with position mapping and scan import.
Fill GRG BAND/CHOIR from confirmed PCO team members using aliased position titles, preview tiebreaks for duplicate roles, and structured Google Doc scan import with template placeholder updates.

Co-authored-by: Cursor <cursoragent@cursor.com>
</commit_message>
<xml_diff>
--- a/downloads/Get Ready Guide (TEMPLATE).docx
+++ b/downloads/Get Ready Guide (TEMPLATE).docx
@@ -178,6 +178,36 @@
         </w:rPr>
       </w:pPr>
       <w:r>
+        <w:t>[Name | First-name Last Initial]: [Position]</w:t>
+      </w:r>
+    </w:p>
+    <w:p>
+      <w:pPr>
+        <w:ind w:left="0" w:firstLine="0"/>
+        <w:rPr>
+          <w:b w:val="1"/>
+          <w:bCs w:val="1"/>
+          <w:sz w:val="18"/>
+          <w:szCs w:val="18"/>
+        </w:rPr>
+      </w:pPr>
+      <w:r>
+        <w:rPr>
+          <w:rtl w:val="0"/>
+        </w:rPr>
+      </w:r>
+    </w:p>
+    <w:p>
+      <w:pPr>
+        <w:ind w:left="720" w:firstLine="0"/>
+        <w:rPr>
+          <w:b w:val="1"/>
+          <w:bCs w:val="1"/>
+          <w:sz w:val="18"/>
+          <w:szCs w:val="18"/>
+        </w:rPr>
+      </w:pPr>
+      <w:r>
         <w:rPr>
           <w:b w:val="1"/>
           <w:bCs w:val="1"/>
@@ -185,7 +215,7 @@
           <w:szCs w:val="18"/>
           <w:rtl w:val="0"/>
         </w:rPr>
-        <w:t xml:space="preserve">[Name | First-name Last Initial]: AC Gui or Keys</w:t>
+        <w:t xml:space="preserve">CHOIR (SUNDAY 7:30 CALL)</w:t>
       </w:r>
     </w:p>
     <w:p>
@@ -211,157 +241,35 @@
           <w:szCs w:val="18"/>
           <w:rtl w:val="0"/>
         </w:rPr>
-        <w:t xml:space="preserve">[Name | First-name Last Initial]: Drums</w:t>
-      </w:r>
-    </w:p>
-    <w:p>
-      <w:pPr>
-        <w:numPr>
-          <w:ilvl w:val="0"/>
-          <w:numId w:val="2"/>
-        </w:numPr>
-        <w:ind w:left="720" w:hanging="360"/>
+        <w:t xml:space="preserve">[Name | First-name Last Initial]: WL</w:t>
+      </w:r>
+    </w:p>
+    <w:p>
+      <w:pPr>
         <w:rPr>
           <w:b w:val="1"/>
           <w:bCs w:val="1"/>
           <w:sz w:val="18"/>
           <w:szCs w:val="18"/>
-          <w:u w:val="none"/>
-        </w:rPr>
-      </w:pPr>
-      <w:r>
+        </w:rPr>
+      </w:pPr>
+      <w:r>
+        <w:rPr>
+          <w:rtl w:val="0"/>
+        </w:rPr>
+      </w:r>
+    </w:p>
+    <w:p>
+      <w:pPr>
         <w:rPr>
           <w:b w:val="1"/>
           <w:bCs w:val="1"/>
           <w:sz w:val="18"/>
           <w:szCs w:val="18"/>
-          <w:rtl w:val="0"/>
-        </w:rPr>
-        <w:t xml:space="preserve">[Name | First-name Last Initial]: Keys</w:t>
-      </w:r>
-    </w:p>
-    <w:p>
-      <w:pPr>
-        <w:ind w:left="0" w:firstLine="0"/>
-        <w:rPr>
-          <w:b w:val="1"/>
-          <w:bCs w:val="1"/>
-          <w:sz w:val="18"/>
-          <w:szCs w:val="18"/>
-        </w:rPr>
-      </w:pPr>
-      <w:r>
-        <w:rPr>
-          <w:rtl w:val="0"/>
-        </w:rPr>
-      </w:r>
-    </w:p>
-    <w:p>
-      <w:pPr>
-        <w:ind w:left="720" w:firstLine="0"/>
-        <w:rPr>
-          <w:b w:val="1"/>
-          <w:bCs w:val="1"/>
-          <w:sz w:val="18"/>
-          <w:szCs w:val="18"/>
-        </w:rPr>
-      </w:pPr>
-      <w:r>
-        <w:rPr>
-          <w:b w:val="1"/>
-          <w:bCs w:val="1"/>
-          <w:sz w:val="18"/>
-          <w:szCs w:val="18"/>
-          <w:rtl w:val="0"/>
-        </w:rPr>
-        <w:t xml:space="preserve">CHOIR (SUNDAY 7:30 CALL)</w:t>
-      </w:r>
-    </w:p>
-    <w:p>
-      <w:pPr>
-        <w:numPr>
-          <w:ilvl w:val="0"/>
-          <w:numId w:val="2"/>
-        </w:numPr>
-        <w:ind w:left="720" w:hanging="360"/>
-        <w:rPr>
-          <w:b w:val="1"/>
-          <w:bCs w:val="1"/>
-          <w:sz w:val="18"/>
-          <w:szCs w:val="18"/>
-          <w:u w:val="none"/>
-        </w:rPr>
-      </w:pPr>
-      <w:r>
-        <w:rPr>
-          <w:b w:val="1"/>
-          <w:bCs w:val="1"/>
-          <w:sz w:val="18"/>
-          <w:szCs w:val="18"/>
-          <w:rtl w:val="0"/>
-        </w:rPr>
-        <w:t xml:space="preserve">[Name | First-name Last Initial]: WL</w:t>
-      </w:r>
-    </w:p>
-    <w:p>
-      <w:pPr>
-        <w:numPr>
-          <w:ilvl w:val="0"/>
-          <w:numId w:val="2"/>
-        </w:numPr>
-        <w:ind w:left="720" w:hanging="360"/>
-        <w:rPr>
-          <w:b w:val="1"/>
-          <w:bCs w:val="1"/>
-          <w:sz w:val="18"/>
-          <w:szCs w:val="18"/>
-        </w:rPr>
-      </w:pPr>
-      <w:r>
-        <w:rPr>
-          <w:b w:val="1"/>
-          <w:bCs w:val="1"/>
-          <w:sz w:val="18"/>
-          <w:szCs w:val="18"/>
-          <w:rtl w:val="0"/>
-        </w:rPr>
-        <w:t xml:space="preserve">[Name | First-name Last Initial]: Part Lead</w:t>
-      </w:r>
-    </w:p>
-    <w:p>
-      <w:pPr>
-        <w:rPr>
-          <w:b w:val="1"/>
-          <w:bCs w:val="1"/>
-          <w:sz w:val="18"/>
-          <w:szCs w:val="18"/>
-        </w:rPr>
-      </w:pPr>
-      <w:r>
-        <w:rPr>
-          <w:rtl w:val="0"/>
-        </w:rPr>
-      </w:r>
-    </w:p>
-    <w:p>
-      <w:pPr>
-        <w:rPr>
-          <w:b w:val="1"/>
-          <w:bCs w:val="1"/>
-          <w:sz w:val="18"/>
-          <w:szCs w:val="18"/>
-        </w:rPr>
-      </w:pPr>
-      <w:r>
-        <w:rPr>
-          <w:b w:val="1"/>
-          <w:bCs w:val="1"/>
-          <w:sz w:val="18"/>
-          <w:szCs w:val="18"/>
-          <w:rtl w:val="0"/>
-        </w:rPr>
-        <w:tab/>
-        <w:t xml:space="preserve">ALL TEAM TECH RUN SUNDAY 08:00 CALL</w:t>
+        </w:rPr>
+      </w:pPr>
+      <w:r>
+        <w:t>[Name | First-name Last Initial]: [Position]</w:t>
       </w:r>
     </w:p>
     <w:p>

</xml_diff>

<commit_message>
Add template-driven scan formatting for Get Ready Guide
Capture {{STYLE_*}} exemplar text styles and column layouts from the
template and apply them to imported song scans, so formatting is edited
in the template rather than hardcoded.

- Bar markers (incl. song-ending "END") render red; lyrics/labels black.
- Pin foregroundColor on every line so a red bar style can't bleed into
  the next song's inserted text.
- Preserve blank lines in lyrics (each is a ProPresenter slide break).
- Apply 1-/2-column section layout in one post-import pass to avoid later
  section breaks resetting earlier sections to single-column.
- First scan reuses the template's page break so song 1 lands on the page
  right after the intro; fix findTextRange off-by-one that left a stray
  "{" from the scans marker.

Co-authored-by: Cursor <cursoragent@cursor.com>
</commit_message>
<xml_diff>
--- a/downloads/Get Ready Guide (TEMPLATE).docx
+++ b/downloads/Get Ready Guide (TEMPLATE).docx
@@ -380,11 +380,72 @@
         <w:t>{{GRG_SCANS_BEGIN}}</w:t>
       </w:r>
     </w:p>
+    <w:p>
+      <w:r>
+        <w:rPr>
+          <w:b/>
+          <w:sz w:val="28"/>
+        </w:rPr>
+        <w:t>{{STYLE_TITLE}}</w:t>
+      </w:r>
+    </w:p>
+    <w:p>
+      <w:r>
+        <w:rPr>
+          <w:rFonts w:ascii="Helvetica Neue" w:hAnsi="Helvetica Neue"/>
+          <w:b w:val="0"/>
+          <w:sz w:val="18"/>
+        </w:rPr>
+        <w:t>{{STYLE_CREDIT}}</w:t>
+      </w:r>
+    </w:p>
+    <w:p>
+      <w:pPr>
+        <w:sectPr>
+          <w:type w:val="continuous"/>
+          <w:pgSz w:h="15840" w:w="12240" w:orient="portrait"/>
+          <w:pgMar w:bottom="1440" w:top="1440" w:left="1440" w:right="1440" w:header="720" w:footer="720"/>
+          <w:cols w:equalWidth="0" w:num="1" w:space="720">
+            <w:col w:space="720" w:w="4320"/>
+            <w:col w:space="0" w:w="4320"/>
+          </w:cols>
+        </w:sectPr>
+      </w:pPr>
+    </w:p>
+    <w:p>
+      <w:r>
+        <w:rPr>
+          <w:b/>
+          <w:color w:val="FF0000"/>
+          <w:sz w:val="24"/>
+        </w:rPr>
+        <w:t>{{STYLE_BAR}}</w:t>
+      </w:r>
+    </w:p>
+    <w:p>
+      <w:r>
+        <w:rPr>
+          <w:b/>
+          <w:sz w:val="24"/>
+          <w:highlight w:val="yellow"/>
+        </w:rPr>
+        <w:t>{{STYLE_LABEL}}</w:t>
+      </w:r>
+    </w:p>
+    <w:p>
+      <w:r>
+        <w:rPr>
+          <w:b w:val="0"/>
+          <w:sz w:val="24"/>
+        </w:rPr>
+        <w:t>{{STYLE_LYRIC}}</w:t>
+      </w:r>
+    </w:p>
     <w:sectPr>
       <w:type w:val="continuous"/>
       <w:pgSz w:h="15840" w:w="12240" w:orient="portrait"/>
       <w:pgMar w:bottom="1440" w:top="1440" w:left="1440" w:right="1440" w:header="720" w:footer="720"/>
-      <w:cols w:equalWidth="0" w:num="2">
+      <w:cols w:equalWidth="0" w:num="2" w:space="720">
         <w:col w:space="720" w:w="4320"/>
         <w:col w:space="0" w:w="4320"/>
       </w:cols>

</xml_diff>